<commit_message>
Update README, report, and gitignore
</commit_message>
<xml_diff>
--- a/report.docx
+++ b/report.docx
@@ -98,7 +98,7 @@
         <w:jc w:val="both"/>
       </w:pPr>
       <w:r>
-        <w:t>I built an interactive visualization system for the US Communities and Crime dataset from the UCI Machine Learning Repository. The dataset has 1,355 communities across 46 US states, with over 100 normalized socio-economic and crime attributes. Some values are missing (marked as "?"), so I filter those out during rendering.</w:t>
+        <w:t>I built this for the US Communities and Crime dataset from the UCI ML Repository. It has 1,355 communities across 46 states and over 100 normalized attributes covering things like income, housing density, policing, and crime rates. Some values are missing in the original data (marked as "?"), so I filter those out before doing anything with them.</w:t>
       </w:r>
     </w:p>
     <w:p>
@@ -106,7 +106,7 @@
         <w:jc w:val="both"/>
       </w:pPr>
       <w:r>
-        <w:t>There are four things I wanted users to be able to do: compare any two continuous attributes across communities, see geographic patterns by grouping communities under states, select subsets of interest with a brush, and drill into specific states or communities through a hierarchy. The app runs on React 18, D3.js 7, and Redux Toolkit for keeping the two views in sync.</w:t>
+        <w:t>The main things I wanted to support: comparing any two continuous attributes side by side, seeing which states certain communities group into, being able to brush-select a subset and track it across both views, and drilling into a state to see its individual communities. Stack is React 18 + D3.js 7 + Redux Toolkit.</w:t>
       </w:r>
     </w:p>
     <w:p>
@@ -157,7 +157,7 @@
         <w:jc w:val="both"/>
       </w:pPr>
       <w:r>
-        <w:t>The layout is split into two linked panels: a scatterplot on the left and a hierarchical view on the right.</w:t>
+        <w:t>Two panels side by side: scatterplot on the left, hierarchy on the right.</w:t>
       </w:r>
     </w:p>
     <w:p>
@@ -165,21 +165,17 @@
         <w:jc w:val="both"/>
       </w:pPr>
       <w:r>
-        <w:t xml:space="preserve">The scatterplot maps two user-selected attributes to x and y position, which is a straightforward way to compare continuous values. Users can switch axes via dropdowns. I added a D3 brush rectangle for multi-select: dragging over an area selects all the points inside it. Selected points go to full opacity with a red stroke, while everything else fades to 0.3 opacity. This makes it easy to pick out a subset and immediately see where those communities fall </w:t>
+        <w:t>The scatterplot puts two user-chosen attributes on x and y. You pick them from dropdowns and can swap them anytime. I added a D3 brush so you can drag a rectangle to select a group of points; selected ones go to full opacity with a red stroke, the rest fade to 0.3. The idea is that once you pick out an interesting cluster, you can immediately see where those communities sit in the hierarchy.</w:t>
       </w:r>
-      <w:r>
-        <w:t>into</w:t>
-      </w:r>
-      <w:r>
-        <w:t xml:space="preserve"> the hierarchy.</w:t>
-      </w:r>
+      <w:r/>
+      <w:r/>
     </w:p>
     <w:p>
       <w:pPr>
         <w:jc w:val="both"/>
       </w:pPr>
       <w:r>
-        <w:t>For the hierarchical view, communities are grouped by state (two levels: State then Community). I tried three different layouts to see which one works best for this data:</w:t>
+        <w:t>For the hierarchy, communities sit under their state (two-level tree: state -&gt; community). I implemented three layouts:</w:t>
       </w:r>
     </w:p>
     <w:tbl>
@@ -409,14 +405,10 @@
         <w:jc w:val="both"/>
       </w:pPr>
       <w:r>
-        <w:t xml:space="preserve">I went with the treemap as the default because it gives you two encodings at once: cell area shows relative </w:t>
+        <w:t>I made treemap the default because it encodes two things at once: cell area and color. I used a yellow-to-red scale for the chosen attribute, so dark red cells stand out immediately and you can spot the high-value communities in each state pretty fast. States are separated by gray borders with a label at the top. The other layouts are still there in the dropdown if you want a different view.</w:t>
       </w:r>
-      <w:r>
-        <w:t>size,</w:t>
-      </w:r>
-      <w:r>
-        <w:t xml:space="preserve"> and a yellow-to-red color scale shows the attribute value. Large dark-red cells jump out immediately, so you can spot high-crime communities within each state at a glance. States have gray borders with labels at the top of each region. The other two layouts are still available via dropdown for when you want a different perspective.</w:t>
-      </w:r>
+      <w:r/>
+      <w:r/>
     </w:p>
     <w:tbl>
       <w:tblPr>
@@ -752,7 +744,7 @@
         <w:jc w:val="both"/>
       </w:pPr>
       <w:r>
-        <w:t>The two views talk to each other through a shared Redux store. When you brush a region on the scatterplot, the indices of the selected communities get dispatched to the store. The hierarchy view picks that up and highlights the matching nodes (full opacity) while fading everything else. It works the other way too: clicking a node in the hierarchy sends that selection back to the store, and the scatterplot highlights the corresponding points with a red stroke.</w:t>
+        <w:t>The two views share state through Redux. When you brush the scatterplot, it dispatches the selected indices to the store; the hierarchy reads that and highlights the matching nodes, fading everything else. Same thing in reverse: clicking a node in the hierarchy dispatches a selection and the scatterplot highlights those points in red.</w:t>
       </w:r>
     </w:p>
     <w:p>
@@ -760,7 +752,7 @@
         <w:jc w:val="both"/>
       </w:pPr>
       <w:r>
-        <w:t>In practice, this means you can brush a cluster of outliers in the scatterplot and instantly see which states they belong to in the treemap, or click on California in the hierarchy and see where its communities land in the attribute space. Dropdowns let you switch X/Y axes and the hierarchy value attribute independently, so you can explore different combinations without losing your selection. I animated the transitions (300 to 1000 ms depending on the action) to keep things from jumping around too abruptly.</w:t>
+        <w:t>In practice you can do things like brush a cluster of high-crime outliers and immediately see which states they come from, or click a state in the treemap and see where its communities land in attribute space. The X/Y axes and the hierarchy value attribute are all controlled independently, so you can explore combinations without losing your current selection. I added transitions (300-1000ms depending on what changed) so it does not feel too jumpy.</w:t>
       </w:r>
     </w:p>
     <w:p>
@@ -811,7 +803,7 @@
         <w:jc w:val="both"/>
       </w:pPr>
       <w:r>
-        <w:t>The work I am submitting is my own. I used Claude (by Anthropic) at various points during development, mostly as a reference tool. When I ran into issues with D3.js rendering or Redux state not syncing the way I expected, I used it to help me debug. I also looked up D3 API details through it, things like brush interactions, hierarchy layouts, and scale configurations. All the design decisions, from choosing coordinated views to picking the treemap as the default, came from what I learned in the HPDAV course. The AI was not used to write this report or generate whole chunks of code.</w:t>
+        <w:t>This is my own work. I used Claude during development mainly to debug. When D3 rendering was off or Redux state was not syncing right, I used it to figure out what was going wrong. I also used it to look up D3 API stuff like how brush events work or the different hierarchy layout APIs. The design choices (coordinated views, treemap as default, the opacity-based highlighting) came from the course material. Claude did not write this report.</w:t>
       </w:r>
     </w:p>
     <w:sectPr>

</xml_diff>

<commit_message>
Add prompts PDF, update report with layout comparison and screenshots, remove tutorial PDF
</commit_message>
<xml_diff>
--- a/report.docx
+++ b/report.docx
@@ -175,7 +175,7 @@
         <w:jc w:val="both"/>
       </w:pPr>
       <w:r>
-        <w:t>For the hierarchy, communities sit under their state (two-level tree: state -&gt; community). I implemented three layouts:</w:t>
+        <w:t>For the hierarchy, communities sit under their state (two-level: state then community). I implemented three layouts and compared them:</w:t>
       </w:r>
     </w:p>
     <w:tbl>
@@ -399,7 +399,23 @@
         </w:tc>
       </w:tr>
     </w:tbl>
-    <w:p/>
+    <w:p>
+      <w:r>
+        <w:t>Treemap: each community is a rectangle whose area is proportional to its size in the hierarchy. Color (yellow to red) encodes the chosen attribute value, so you get two visual channels at once. States have labeled borders that make the geographic grouping obvious. The downside is that very small communities get tiny cells that are hard to click. This is my preferred layout because the area + color combination makes it easy to spot high-crime states at a glance.</w:t>
+      </w:r>
+    </w:p>
+    <w:p>
+      <w:pPr/>
+      <w:r>
+        <w:t>Circle packing: communities are circles packed inside larger state circles. The layout is visually engaging and makes state boundaries clear, but the wasted whitespace between circles makes it harder to compare sizes accurately. Clicking small community circles is also fiddly. Good for getting a quick sense of which states have the most communities.</w:t>
+      </w:r>
+    </w:p>
+    <w:p>
+      <w:pPr/>
+      <w:r>
+        <w:t>Tree layout (horizontal dendrogram): states branch off a root node, with communities as leaves. Every node is the same size so there is no area encoding, just topology. It is the clearest way to see the hierarchy structure itself, but with 1,355 communities the leaf nodes overlap badly and color is the only way to distinguish values. Useful for understanding structure, not so great for spotting patterns in attribute values.</w:t>
+      </w:r>
+    </w:p>
     <w:p>
       <w:pPr>
         <w:jc w:val="both"/>
@@ -712,6 +728,11 @@
     </w:tbl>
     <w:p>
       <w:pPr>
+        <w:jc w:val="center"/>
+      </w:pPr>
+    </w:p>
+    <w:p>
+      <w:pPr>
         <w:pStyle w:val="Heading2"/>
         <w:rPr>
           <w:color w:val="auto"/>
@@ -753,6 +774,57 @@
       </w:pPr>
       <w:r>
         <w:t>In practice you can do things like brush a cluster of high-crime outliers and immediately see which states they come from, or click a state in the treemap and see where its communities land in attribute space. The X/Y axes and the hierarchy value attribute are all controlled independently, so you can explore combinations without losing your current selection. I added transitions (300-1000ms depending on what changed) so it does not feel too jumpy.</w:t>
+      </w:r>
+    </w:p>
+    <w:p>
+      <w:pPr>
+        <w:jc w:val="center"/>
+      </w:pPr>
+      <w:r>
+        <w:drawing>
+          <wp:inline xmlns:a="http://schemas.openxmlformats.org/drawingml/2006/main" xmlns:pic="http://schemas.openxmlformats.org/drawingml/2006/picture">
+            <wp:extent cx="4114800" cy="2656985"/>
+            <wp:docPr id="5" name="Picture 5"/>
+            <wp:cNvGraphicFramePr>
+              <a:graphicFrameLocks noChangeAspect="1"/>
+            </wp:cNvGraphicFramePr>
+            <a:graphic>
+              <a:graphicData uri="http://schemas.openxmlformats.org/drawingml/2006/picture">
+                <pic:pic>
+                  <pic:nvPicPr>
+                    <pic:cNvPr id="0" name="image.png"/>
+                    <pic:cNvPicPr/>
+                  </pic:nvPicPr>
+                  <pic:blipFill>
+                    <a:blip r:embed="rId7"/>
+                    <a:stretch>
+                      <a:fillRect/>
+                    </a:stretch>
+                  </pic:blipFill>
+                  <pic:spPr>
+                    <a:xfrm>
+                      <a:off x="0" y="0"/>
+                      <a:ext cx="4114800" cy="2656985"/>
+                    </a:xfrm>
+                    <a:prstGeom prst="rect"/>
+                  </pic:spPr>
+                </pic:pic>
+              </a:graphicData>
+            </a:graphic>
+          </wp:inline>
+        </w:drawing>
+      </w:r>
+    </w:p>
+    <w:p>
+      <w:pPr>
+        <w:jc w:val="center"/>
+      </w:pPr>
+      <w:r>
+        <w:rPr>
+          <w:i/>
+          <w:sz w:val="16"/>
+        </w:rPr>
+        <w:t>Brush selection on scatterplot synced to treemap hierarchy</w:t>
       </w:r>
     </w:p>
     <w:p>

</xml_diff>